<commit_message>
Update architecture docs for modular UI refactor
</commit_message>
<xml_diff>
--- a/docs/Software_Design_and_Architecture_Document.docx
+++ b/docs/Software_Design_and_Architecture_Document.docx
@@ -179,7 +179,7 @@
           </w:tcPr>
           <w:p>
             <w:r>
-              <w:t>`mcp_server.py`, `agent/`, `Core/`, `Utils/`, `streamlit_app.py`, `tests/`, `Input/`, `output/`</w:t>
+              <w:t>`streamlit_app.py`, `App/pages/`, `App/data_loaders.py`, `App/workflow_actions.py`, `App/workflow_ui.py`, `mcp_server.py`, `agent/`, `Core/`, `Utils/`, `tests/`, `Input/`, `output/`</w:t>
             </w:r>
           </w:p>
         </w:tc>
@@ -689,6 +689,10 @@
         <w:t>}</w:t>
         <w:br/>
         <w:br/>
+        <w:t>Streamlit --&gt; Pages</w:t>
+        <w:br/>
+        <w:t>Pages --&gt; MCP</w:t>
+        <w:br/>
         <w:t>Streamlit --&gt; MCP</w:t>
         <w:br/>
         <w:t>Claude --&gt; MCP</w:t>
@@ -1327,7 +1331,7 @@
         <w:pStyle w:val="Heading2"/>
       </w:pPr>
       <w:r>
-        <w:t>6.1 Streamlit UI (`streamlit_app.py`)</w:t>
+        <w:t>6.1 Streamlit UI Shell and Page Package</w:t>
       </w:r>
     </w:p>
     <w:p/>
@@ -1370,17 +1374,17 @@
           </w:tcPr>
           <w:p>
             <w:r>
-              <w:t>Purpose</w:t>
-            </w:r>
-          </w:p>
-        </w:tc>
-        <w:tc>
-          <w:tcPr>
-            <w:tcW w:type="dxa" w:w="5040"/>
-          </w:tcPr>
-          <w:p>
-            <w:r>
-              <w:t>Provides an interactive operator interface for admins, release engineers, and QA users.</w:t>
+              <w:t>Shell</w:t>
+            </w:r>
+          </w:p>
+        </w:tc>
+        <w:tc>
+          <w:tcPr>
+            <w:tcW w:type="dxa" w:w="5040"/>
+          </w:tcPr>
+          <w:p>
+            <w:r>
+              <w:t>`streamlit_app.py`</w:t>
             </w:r>
           </w:p>
         </w:tc>
@@ -1392,17 +1396,17 @@
           </w:tcPr>
           <w:p>
             <w:r>
-              <w:t>Responsibilities</w:t>
-            </w:r>
-          </w:p>
-        </w:tc>
-        <w:tc>
-          <w:tcPr>
-            <w:tcW w:type="dxa" w:w="5040"/>
-          </w:tcPr>
-          <w:p>
-            <w:r>
-              <w:t>Authentication/role-aware views, pipeline execution controls, configuration display/edit workflows, report visualization, status summaries, cache/report inspection.</w:t>
+              <w:t>Page Package</w:t>
+            </w:r>
+          </w:p>
+        </w:tc>
+        <w:tc>
+          <w:tcPr>
+            <w:tcW w:type="dxa" w:w="5040"/>
+          </w:tcPr>
+          <w:p>
+            <w:r>
+              <w:t>`App/pages/`</w:t>
             </w:r>
           </w:p>
         </w:tc>
@@ -1414,17 +1418,17 @@
           </w:tcPr>
           <w:p>
             <w:r>
-              <w:t>Technologies</w:t>
-            </w:r>
-          </w:p>
-        </w:tc>
-        <w:tc>
-          <w:tcPr>
-            <w:tcW w:type="dxa" w:w="5040"/>
-          </w:tcPr>
-          <w:p>
-            <w:r>
-              <w:t>Streamlit, Altair, Python standard libraries, local project services.</w:t>
+              <w:t>Purpose</w:t>
+            </w:r>
+          </w:p>
+        </w:tc>
+        <w:tc>
+          <w:tcPr>
+            <w:tcW w:type="dxa" w:w="5040"/>
+          </w:tcPr>
+          <w:p>
+            <w:r>
+              <w:t>Provides an interactive operator interface for admins, release engineers, and QA users while keeping the Streamlit entry point thin and maintainable.</w:t>
             </w:r>
           </w:p>
         </w:tc>
@@ -1436,17 +1440,17 @@
           </w:tcPr>
           <w:p>
             <w:r>
-              <w:t>Inputs</w:t>
-            </w:r>
-          </w:p>
-        </w:tc>
-        <w:tc>
-          <w:tcPr>
-            <w:tcW w:type="dxa" w:w="5040"/>
-          </w:tcPr>
-          <w:p>
-            <w:r>
-              <w:t>User credentials, role selection, category selection, refresh controls, local output files.</w:t>
+              <w:t>Shell Responsibilities</w:t>
+            </w:r>
+          </w:p>
+        </w:tc>
+        <w:tc>
+          <w:tcPr>
+            <w:tcW w:type="dxa" w:w="5040"/>
+          </w:tcPr>
+          <w:p>
+            <w:r>
+              <w:t>Page configuration, authentication gate, schedule synchronization, data loading orchestration, page routing, and construction of the shared `page_context()` adapter.</w:t>
             </w:r>
           </w:p>
         </w:tc>
@@ -1458,17 +1462,17 @@
           </w:tcPr>
           <w:p>
             <w:r>
-              <w:t>Outputs</w:t>
-            </w:r>
-          </w:p>
-        </w:tc>
-        <w:tc>
-          <w:tcPr>
-            <w:tcW w:type="dxa" w:w="5040"/>
-          </w:tcPr>
-          <w:p>
-            <w:r>
-              <w:t>Dashboards, charts, tables, report previews, operational status indicators.</w:t>
+              <w:t>Page Responsibilities</w:t>
+            </w:r>
+          </w:p>
+        </w:tc>
+        <w:tc>
+          <w:tcPr>
+            <w:tcW w:type="dxa" w:w="5040"/>
+          </w:tcPr>
+          <w:p>
+            <w:r>
+              <w:t>Role-specific UI screens, Streamlit widgets, page-level actions, tables, charts, report previews, QA signoff, scanner upload, user management, and cache/audit views.</w:t>
             </w:r>
           </w:p>
         </w:tc>
@@ -1480,17 +1484,17 @@
           </w:tcPr>
           <w:p>
             <w:r>
-              <w:t>Integrations</w:t>
-            </w:r>
-          </w:p>
-        </w:tc>
-        <w:tc>
-          <w:tcPr>
-            <w:tcW w:type="dxa" w:w="5040"/>
-          </w:tcPr>
-          <w:p>
-            <w:r>
-              <w:t>MCP server/pipeline functions, `config.json`, `output/`, cache metrics, generated Excel/JSON artifacts.</w:t>
+              <w:t>Technologies</w:t>
+            </w:r>
+          </w:p>
+        </w:tc>
+        <w:tc>
+          <w:tcPr>
+            <w:tcW w:type="dxa" w:w="5040"/>
+          </w:tcPr>
+          <w:p>
+            <w:r>
+              <w:t>Streamlit, Altair, pandas, modular Python page modules, local project services.</w:t>
             </w:r>
           </w:p>
         </w:tc>
@@ -1502,6 +1506,72 @@
           </w:tcPr>
           <w:p>
             <w:r>
+              <w:t>Inputs</w:t>
+            </w:r>
+          </w:p>
+        </w:tc>
+        <w:tc>
+          <w:tcPr>
+            <w:tcW w:type="dxa" w:w="5040"/>
+          </w:tcPr>
+          <w:p>
+            <w:r>
+              <w:t>User credentials, role selection, team/release context, refresh controls, uploaded files, local output artifacts.</w:t>
+            </w:r>
+          </w:p>
+        </w:tc>
+      </w:tr>
+      <w:tr>
+        <w:tc>
+          <w:tcPr>
+            <w:tcW w:type="dxa" w:w="5040"/>
+          </w:tcPr>
+          <w:p>
+            <w:r>
+              <w:t>Outputs</w:t>
+            </w:r>
+          </w:p>
+        </w:tc>
+        <w:tc>
+          <w:tcPr>
+            <w:tcW w:type="dxa" w:w="5040"/>
+          </w:tcPr>
+          <w:p>
+            <w:r>
+              <w:t>Dashboards, charts, tables, report previews, operational status indicators, QA updates, scanner findings, user administration changes.</w:t>
+            </w:r>
+          </w:p>
+        </w:tc>
+      </w:tr>
+      <w:tr>
+        <w:tc>
+          <w:tcPr>
+            <w:tcW w:type="dxa" w:w="5040"/>
+          </w:tcPr>
+          <w:p>
+            <w:r>
+              <w:t>Integrations</w:t>
+            </w:r>
+          </w:p>
+        </w:tc>
+        <w:tc>
+          <w:tcPr>
+            <w:tcW w:type="dxa" w:w="5040"/>
+          </w:tcPr>
+          <w:p>
+            <w:r>
+              <w:t>`App/data_loaders.py`, `App/workflow_actions.py`, `App/workflow_ui.py`, `config.json`, scoped `output/`, generated Excel/JSON artifacts.</w:t>
+            </w:r>
+          </w:p>
+        </w:tc>
+      </w:tr>
+      <w:tr>
+        <w:tc>
+          <w:tcPr>
+            <w:tcW w:type="dxa" w:w="5040"/>
+          </w:tcPr>
+          <w:p>
+            <w:r>
               <w:t>Communication</w:t>
             </w:r>
           </w:p>
@@ -1512,7 +1582,223 @@
           </w:tcPr>
           <w:p>
             <w:r>
-              <w:t>Local Python calls and file-based artifact consumption. In a future deployment, this boundary should move to authenticated HTTP/MCP calls.</w:t>
+              <w:t>Local Python calls through a narrow page context. Future deployment can move this boundary to authenticated HTTP/MCP calls.</w:t>
+            </w:r>
+          </w:p>
+        </w:tc>
+      </w:tr>
+    </w:tbl>
+    <w:p/>
+    <w:p>
+      <w:r>
+        <w:t>Current page package layout:</w:t>
+      </w:r>
+    </w:p>
+    <w:p/>
+    <w:tbl>
+      <w:tblPr>
+        <w:tblStyle w:val="TableGrid"/>
+        <w:tblW w:type="auto" w:w="0"/>
+        <w:tblLook w:firstColumn="1" w:firstRow="1" w:lastColumn="0" w:lastRow="0" w:noHBand="0" w:noVBand="1" w:val="04A0"/>
+      </w:tblPr>
+      <w:tblGrid>
+        <w:gridCol w:w="5040"/>
+        <w:gridCol w:w="5040"/>
+      </w:tblGrid>
+      <w:tr>
+        <w:tc>
+          <w:tcPr>
+            <w:tcW w:type="dxa" w:w="5040"/>
+          </w:tcPr>
+          <w:p>
+            <w:r>
+              <w:t>Module</w:t>
+            </w:r>
+          </w:p>
+        </w:tc>
+        <w:tc>
+          <w:tcPr>
+            <w:tcW w:type="dxa" w:w="5040"/>
+          </w:tcPr>
+          <w:p>
+            <w:r>
+              <w:t>Responsibility</w:t>
+            </w:r>
+          </w:p>
+        </w:tc>
+      </w:tr>
+      <w:tr>
+        <w:tc>
+          <w:tcPr>
+            <w:tcW w:type="dxa" w:w="5040"/>
+          </w:tcPr>
+          <w:p>
+            <w:r>
+              <w:t>`App/pages/context.py`</w:t>
+            </w:r>
+          </w:p>
+        </w:tc>
+        <w:tc>
+          <w:tcPr>
+            <w:tcW w:type="dxa" w:w="5040"/>
+          </w:tcPr>
+          <w:p>
+            <w:r>
+              <w:t>Team and product release selector used by dashboard and operations pages.</w:t>
+            </w:r>
+          </w:p>
+        </w:tc>
+      </w:tr>
+      <w:tr>
+        <w:tc>
+          <w:tcPr>
+            <w:tcW w:type="dxa" w:w="5040"/>
+          </w:tcPr>
+          <w:p>
+            <w:r>
+              <w:t>`App/pages/dashboard.py`</w:t>
+            </w:r>
+          </w:p>
+        </w:tc>
+        <w:tc>
+          <w:tcPr>
+            <w:tcW w:type="dxa" w:w="5040"/>
+          </w:tcPr>
+          <w:p>
+            <w:r>
+              <w:t>Dashboard, software inventory, latest versions, version comparison, package readiness, and compatibility check.</w:t>
+            </w:r>
+          </w:p>
+        </w:tc>
+      </w:tr>
+      <w:tr>
+        <w:tc>
+          <w:tcPr>
+            <w:tcW w:type="dxa" w:w="5040"/>
+          </w:tcPr>
+          <w:p>
+            <w:r>
+              <w:t>`App/pages/operations.py`</w:t>
+            </w:r>
+          </w:p>
+        </w:tc>
+        <w:tc>
+          <w:tcPr>
+            <w:tcW w:type="dxa" w:w="5040"/>
+          </w:tcPr>
+          <w:p>
+            <w:r>
+              <w:t>Manual workflow actions, schedule controls, role workflow execution, and operation summaries.</w:t>
+            </w:r>
+          </w:p>
+        </w:tc>
+      </w:tr>
+      <w:tr>
+        <w:tc>
+          <w:tcPr>
+            <w:tcW w:type="dxa" w:w="5040"/>
+          </w:tcPr>
+          <w:p>
+            <w:r>
+              <w:t>`App/pages/qa_validation.py`</w:t>
+            </w:r>
+          </w:p>
+        </w:tc>
+        <w:tc>
+          <w:tcPr>
+            <w:tcW w:type="dxa" w:w="5040"/>
+          </w:tcPr>
+          <w:p>
+            <w:r>
+              <w:t>QA validation dashboard, manual QA update, evidence upload, QA completion signoff, and signoff history.</w:t>
+            </w:r>
+          </w:p>
+        </w:tc>
+      </w:tr>
+      <w:tr>
+        <w:tc>
+          <w:tcPr>
+            <w:tcW w:type="dxa" w:w="5040"/>
+          </w:tcPr>
+          <w:p>
+            <w:r>
+              <w:t>`App/pages/security.py`</w:t>
+            </w:r>
+          </w:p>
+        </w:tc>
+        <w:tc>
+          <w:tcPr>
+            <w:tcW w:type="dxa" w:w="5040"/>
+          </w:tcPr>
+          <w:p>
+            <w:r>
+              <w:t>Vulnerability assessment, uploaded scanner report parsing, security heatmap, and review queue.</w:t>
+            </w:r>
+          </w:p>
+        </w:tc>
+      </w:tr>
+      <w:tr>
+        <w:tc>
+          <w:tcPr>
+            <w:tcW w:type="dxa" w:w="5040"/>
+          </w:tcPr>
+          <w:p>
+            <w:r>
+              <w:t>`App/pages/admin.py`</w:t>
+            </w:r>
+          </w:p>
+        </w:tc>
+        <w:tc>
+          <w:tcPr>
+            <w:tcW w:type="dxa" w:w="5040"/>
+          </w:tcPr>
+          <w:p>
+            <w:r>
+              <w:t>Audit logs, settings, admin user management, release input upload, and cache analytics.</w:t>
+            </w:r>
+          </w:p>
+        </w:tc>
+      </w:tr>
+      <w:tr>
+        <w:tc>
+          <w:tcPr>
+            <w:tcW w:type="dxa" w:w="5040"/>
+          </w:tcPr>
+          <w:p>
+            <w:r>
+              <w:t>`App/pages/reports.py`</w:t>
+            </w:r>
+          </w:p>
+        </w:tc>
+        <w:tc>
+          <w:tcPr>
+            <w:tcW w:type="dxa" w:w="5040"/>
+          </w:tcPr>
+          <w:p>
+            <w:r>
+              <w:t>Report package download and HTML email preview.</w:t>
+            </w:r>
+          </w:p>
+        </w:tc>
+      </w:tr>
+      <w:tr>
+        <w:tc>
+          <w:tcPr>
+            <w:tcW w:type="dxa" w:w="5040"/>
+          </w:tcPr>
+          <w:p>
+            <w:r>
+              <w:t>`App/pages/support.py`</w:t>
+            </w:r>
+          </w:p>
+        </w:tc>
+        <w:tc>
+          <w:tcPr>
+            <w:tcW w:type="dxa" w:w="5040"/>
+          </w:tcPr>
+          <w:p>
+            <w:r>
+              <w:t>Shared page helpers for posture cards, output visibility, and operation result rendering.</w:t>
             </w:r>
           </w:p>
         </w:tc>
@@ -1532,19 +1818,275 @@
     </w:p>
     <w:p>
       <w:r>
-        <w:t>2. UI reads configuration and output artifacts.</w:t>
+        <w:t>2. `streamlit_app.py` reads active configuration and scoped output artifacts through `App/data_loaders.py`.</w:t>
       </w:r>
     </w:p>
     <w:p>
       <w:r>
-        <w:t>3. User triggers a pipeline or reviews existing reports.</w:t>
+        <w:t>3. Role-aware navigation is built by `App/navigation.py`, including QA Validation for Admin and QA Engineer roles.</w:t>
       </w:r>
     </w:p>
     <w:p>
       <w:r>
-        <w:t>4. UI displays comparison, vulnerability, readiness, QA, and cache metrics.</w:t>
+        <w:t>4. The selected page module renders its UI using `page_context()` for shared services and UI helpers.</w:t>
       </w:r>
     </w:p>
+    <w:p>
+      <w:r>
+        <w:t>5. Page modules call `App/workflow_actions.py` for workflow side effects and service modules for focused operations.</w:t>
+      </w:r>
+    </w:p>
+    <w:p>
+      <w:r>
+        <w:t>6. UI displays comparison, vulnerability, readiness, QA, report, cache, and audit metrics.</w:t>
+      </w:r>
+    </w:p>
+    <w:p/>
+    <w:p>
+      <w:pPr>
+        <w:pStyle w:val="Heading2"/>
+      </w:pPr>
+      <w:r>
+        <w:t>6.2 Streamlit Supporting Modules</w:t>
+      </w:r>
+    </w:p>
+    <w:p/>
+    <w:tbl>
+      <w:tblPr>
+        <w:tblStyle w:val="TableGrid"/>
+        <w:tblW w:type="auto" w:w="0"/>
+        <w:tblLook w:firstColumn="1" w:firstRow="1" w:lastColumn="0" w:lastRow="0" w:noHBand="0" w:noVBand="1" w:val="04A0"/>
+      </w:tblPr>
+      <w:tblGrid>
+        <w:gridCol w:w="3360"/>
+        <w:gridCol w:w="3360"/>
+        <w:gridCol w:w="3360"/>
+      </w:tblGrid>
+      <w:tr>
+        <w:tc>
+          <w:tcPr>
+            <w:tcW w:type="dxa" w:w="3360"/>
+          </w:tcPr>
+          <w:p>
+            <w:r>
+              <w:t>Module</w:t>
+            </w:r>
+          </w:p>
+        </w:tc>
+        <w:tc>
+          <w:tcPr>
+            <w:tcW w:type="dxa" w:w="3360"/>
+          </w:tcPr>
+          <w:p>
+            <w:r>
+              <w:t>Purpose</w:t>
+            </w:r>
+          </w:p>
+        </w:tc>
+        <w:tc>
+          <w:tcPr>
+            <w:tcW w:type="dxa" w:w="3360"/>
+          </w:tcPr>
+          <w:p>
+            <w:r>
+              <w:t>Notes</w:t>
+            </w:r>
+          </w:p>
+        </w:tc>
+      </w:tr>
+      <w:tr>
+        <w:tc>
+          <w:tcPr>
+            <w:tcW w:type="dxa" w:w="3360"/>
+          </w:tcPr>
+          <w:p>
+            <w:r>
+              <w:t>`App/data_loaders.py`</w:t>
+            </w:r>
+          </w:p>
+        </w:tc>
+        <w:tc>
+          <w:tcPr>
+            <w:tcW w:type="dxa" w:w="3360"/>
+          </w:tcPr>
+          <w:p>
+            <w:r>
+              <w:t>Loads JSON/text/metrics files and normalizes current, latest, comparison, vulnerability, package readiness, QA validation, and test impact data.</w:t>
+            </w:r>
+          </w:p>
+        </w:tc>
+        <w:tc>
+          <w:tcPr>
+            <w:tcW w:type="dxa" w:w="3360"/>
+          </w:tcPr>
+          <w:p>
+            <w:r>
+              <w:t>Keeps data shaping testable outside Streamlit pages.</w:t>
+            </w:r>
+          </w:p>
+        </w:tc>
+      </w:tr>
+      <w:tr>
+        <w:tc>
+          <w:tcPr>
+            <w:tcW w:type="dxa" w:w="3360"/>
+          </w:tcPr>
+          <w:p>
+            <w:r>
+              <w:t>`App/workflow_actions.py`</w:t>
+            </w:r>
+          </w:p>
+        </w:tc>
+        <w:tc>
+          <w:tcPr>
+            <w:tcW w:type="dxa" w:w="3360"/>
+          </w:tcPr>
+          <w:p>
+            <w:r>
+              <w:t>Executes shared scans, role workflows, individual fetch/compare actions, email sending, and vendor compatibility resolution.</w:t>
+            </w:r>
+          </w:p>
+        </w:tc>
+        <w:tc>
+          <w:tcPr>
+            <w:tcW w:type="dxa" w:w="3360"/>
+          </w:tcPr>
+          <w:p>
+            <w:r>
+              <w:t>Separates side-effect actions from UI rendering.</w:t>
+            </w:r>
+          </w:p>
+        </w:tc>
+      </w:tr>
+      <w:tr>
+        <w:tc>
+          <w:tcPr>
+            <w:tcW w:type="dxa" w:w="3360"/>
+          </w:tcPr>
+          <w:p>
+            <w:r>
+              <w:t>`App/workflow_ui.py`</w:t>
+            </w:r>
+          </w:p>
+        </w:tc>
+        <w:tc>
+          <w:tcPr>
+            <w:tcW w:type="dxa" w:w="3360"/>
+          </w:tcPr>
+          <w:p>
+            <w:r>
+              <w:t>Renders Workflow Monitor and planner/verifier status.</w:t>
+            </w:r>
+          </w:p>
+        </w:tc>
+        <w:tc>
+          <w:tcPr>
+            <w:tcW w:type="dxa" w:w="3360"/>
+          </w:tcPr>
+          <w:p>
+            <w:r>
+              <w:t>Admin-only navigation entry.</w:t>
+            </w:r>
+          </w:p>
+        </w:tc>
+      </w:tr>
+      <w:tr>
+        <w:tc>
+          <w:tcPr>
+            <w:tcW w:type="dxa" w:w="3360"/>
+          </w:tcPr>
+          <w:p>
+            <w:r>
+              <w:t>`App/layout.py`</w:t>
+            </w:r>
+          </w:p>
+        </w:tc>
+        <w:tc>
+          <w:tcPr>
+            <w:tcW w:type="dxa" w:w="3360"/>
+          </w:tcPr>
+          <w:p>
+            <w:r>
+              <w:t>CSS injection, header, section title, access-denied UI, and visual helper functions.</w:t>
+            </w:r>
+          </w:p>
+        </w:tc>
+        <w:tc>
+          <w:tcPr>
+            <w:tcW w:type="dxa" w:w="3360"/>
+          </w:tcPr>
+          <w:p>
+            <w:r>
+              <w:t>Centralizes presentation primitives.</w:t>
+            </w:r>
+          </w:p>
+        </w:tc>
+      </w:tr>
+      <w:tr>
+        <w:tc>
+          <w:tcPr>
+            <w:tcW w:type="dxa" w:w="3360"/>
+          </w:tcPr>
+          <w:p>
+            <w:r>
+              <w:t>`App/navigation.py`</w:t>
+            </w:r>
+          </w:p>
+        </w:tc>
+        <w:tc>
+          <w:tcPr>
+            <w:tcW w:type="dxa" w:w="3360"/>
+          </w:tcPr>
+          <w:p>
+            <w:r>
+              <w:t>Role-aware page list and sidebar rendering.</w:t>
+            </w:r>
+          </w:p>
+        </w:tc>
+        <w:tc>
+          <w:tcPr>
+            <w:tcW w:type="dxa" w:w="3360"/>
+          </w:tcPr>
+          <w:p>
+            <w:r>
+              <w:t>Inserts QA Validation for Admin and QA Engineer roles.</w:t>
+            </w:r>
+          </w:p>
+        </w:tc>
+      </w:tr>
+      <w:tr>
+        <w:tc>
+          <w:tcPr>
+            <w:tcW w:type="dxa" w:w="3360"/>
+          </w:tcPr>
+          <w:p>
+            <w:r>
+              <w:t>`App/ui_components.py`</w:t>
+            </w:r>
+          </w:p>
+        </w:tc>
+        <w:tc>
+          <w:tcPr>
+            <w:tcW w:type="dxa" w:w="3360"/>
+          </w:tcPr>
+          <w:p>
+            <w:r>
+              <w:t>Shared operational tables, searchable tables, bar charts, donut charts, and readable cell styling.</w:t>
+            </w:r>
+          </w:p>
+        </w:tc>
+        <w:tc>
+          <w:tcPr>
+            <w:tcW w:type="dxa" w:w="3360"/>
+          </w:tcPr>
+          <w:p>
+            <w:r>
+              <w:t>Avoids repeated UI table/chart code.</w:t>
+            </w:r>
+          </w:p>
+        </w:tc>
+      </w:tr>
+    </w:tbl>
     <w:p/>
     <w:p>
       <w:pPr>
@@ -9563,6 +10105,70 @@
         <w:t>18. Testing Strategy</w:t>
       </w:r>
     </w:p>
+    <w:p/>
+    <w:p>
+      <w:r>
+        <w:t>Recent focused coverage added for the modular UI refactor includes:</w:t>
+      </w:r>
+    </w:p>
+    <w:p/>
+    <w:p>
+      <w:pPr>
+        <w:pStyle w:val="ListBullet"/>
+      </w:pPr>
+      <w:r>
+        <w:t>Page package import and routing smoke coverage.</w:t>
+      </w:r>
+    </w:p>
+    <w:p>
+      <w:pPr>
+        <w:pStyle w:val="ListBullet"/>
+      </w:pPr>
+      <w:r>
+        <w:t>QA signoff save/load/history behavior.</w:t>
+      </w:r>
+    </w:p>
+    <w:p>
+      <w:pPr>
+        <w:pStyle w:val="ListBullet"/>
+      </w:pPr>
+      <w:r>
+        <w:t>Input upload target path behavior for team/release release inputs.</w:t>
+      </w:r>
+    </w:p>
+    <w:p>
+      <w:pPr>
+        <w:pStyle w:val="ListBullet"/>
+      </w:pPr>
+      <w:r>
+        <w:t>Vulnerability scanner JSON parse and persisted findings behavior.</w:t>
+      </w:r>
+    </w:p>
+    <w:p>
+      <w:pPr>
+        <w:pStyle w:val="ListBullet"/>
+      </w:pPr>
+      <w:r>
+        <w:t>Page support helper output visibility behavior.</w:t>
+      </w:r>
+    </w:p>
+    <w:p>
+      <w:pPr>
+        <w:pStyle w:val="ListBullet"/>
+      </w:pPr>
+      <w:r>
+        <w:t>QA signoff permission helper behavior.</w:t>
+      </w:r>
+    </w:p>
+    <w:p>
+      <w:pPr>
+        <w:pStyle w:val="ListBullet"/>
+      </w:pPr>
+      <w:r>
+        <w:t>Navigation coverage ensuring `QA Validation` is visible for Admin and QA Engineer roles.</w:t>
+      </w:r>
+    </w:p>
+    <w:p/>
     <w:p/>
     <w:p>
       <w:r>

</xml_diff>

<commit_message>
Move server inventory to YAML config
</commit_message>
<xml_diff>
--- a/docs/Software_Design_and_Architecture_Document.docx
+++ b/docs/Software_Design_and_Architecture_Document.docx
@@ -4329,7 +4329,7 @@
           </w:tcPr>
           <w:p>
             <w:r>
-              <w:t>Load server configuration, execute SSH commands, call HTTP APIs, parse software-specific versions.</w:t>
+              <w:t>Load release/team/global server YAML through `App/server_config.py`, execute SSH commands, call HTTP APIs, parse software-specific versions.</w:t>
             </w:r>
           </w:p>
         </w:tc>
@@ -4373,7 +4373,7 @@
           </w:tcPr>
           <w:p>
             <w:r>
-              <w:t>Software name and server configuration.</w:t>
+              <w:t>Software name and server configuration from `Input/teams/&lt;team&gt;/releases/&lt;release&gt;/servers.yml`, `Input/teams/&lt;team&gt;/servers.yml`, or `Input/servers.yml`.</w:t>
             </w:r>
           </w:p>
         </w:tc>

</xml_diff>

<commit_message>
Remove legacy server config fallback
</commit_message>
<xml_diff>
--- a/docs/Software_Design_and_Architecture_Document.docx
+++ b/docs/Software_Design_and_Architecture_Document.docx
@@ -6328,7 +6328,49 @@
           </w:tcPr>
           <w:p>
             <w:r>
-              <w:t>API keys, schedule, SMTP, cache, users, server commands, input/output paths</w:t>
+              <w:t>API keys, schedule, SMTP, cache, users, input/output paths</w:t>
+            </w:r>
+          </w:p>
+        </w:tc>
+      </w:tr>
+      <w:tr>
+        <w:tc>
+          <w:tcPr>
+            <w:tcW w:type="dxa" w:w="2520"/>
+          </w:tcPr>
+          <w:p>
+            <w:r>
+              <w:t>`Input/teams/&lt;team&gt;/releases/&lt;release&gt;/servers.yml`</w:t>
+            </w:r>
+          </w:p>
+        </w:tc>
+        <w:tc>
+          <w:tcPr>
+            <w:tcW w:type="dxa" w:w="2520"/>
+          </w:tcPr>
+          <w:p>
+            <w:r>
+              <w:t>YAML</w:t>
+            </w:r>
+          </w:p>
+        </w:tc>
+        <w:tc>
+          <w:tcPr>
+            <w:tcW w:type="dxa" w:w="2520"/>
+          </w:tcPr>
+          <w:p>
+            <w:r>
+              <w:t>Release infrastructure inventory</w:t>
+            </w:r>
+          </w:p>
+        </w:tc>
+        <w:tc>
+          <w:tcPr>
+            <w:tcW w:type="dxa" w:w="2520"/>
+          </w:tcPr>
+          <w:p>
+            <w:r>
+              <w:t>SSH/HTTP server targets and command definitions</w:t>
             </w:r>
           </w:p>
         </w:tc>
@@ -9948,7 +9990,7 @@
     <w:p/>
     <w:p>
       <w:r>
-        <w:t>Configuration is centralized in `config.json`:</w:t>
+        <w:t>Application runtime configuration is centralized in `config.json`:</w:t>
       </w:r>
     </w:p>
     <w:p/>
@@ -10000,12 +10042,20 @@
         <w:t>Local authentication users and roles.</w:t>
       </w:r>
     </w:p>
+    <w:p/>
     <w:p>
-      <w:pPr>
-        <w:pStyle w:val="ListBullet"/>
-      </w:pPr>
       <w:r>
-        <w:t>Server query map with SSH/HTTP command definitions.</w:t>
+        <w:t>Live server inventory is intentionally externalized to YAML and loaded in this</w:t>
+      </w:r>
+    </w:p>
+    <w:p>
+      <w:r>
+        <w:t>order: release-scoped `servers.yml`, team-scoped `servers.yml`, then global</w:t>
+      </w:r>
+    </w:p>
+    <w:p>
+      <w:r>
+        <w:t>`Input/servers.yml`.</w:t>
       </w:r>
     </w:p>
     <w:p/>

</xml_diff>